<commit_message>
Edition 7: Replace rigid citations with general legislation references; create Измененные_ACT folder
Co-authored-by: arena-agent <297053741+arena-agent@users.noreply.github.com>
</commit_message>
<xml_diff>
--- a/Законы/Законопроекты/ACT. 001 — Развёрнутая редакция для чтения.docx
+++ b/Законы/Законопроекты/ACT. 001 — Развёрнутая редакция для чтения.docx
@@ -2503,7 +2503,7 @@
           <w:sz w:val="20"/>
           <w:u w:val="none"/>
         </w:rPr>
-        <w:t>а) военнослужащие SANG — в отношении лица, совершившего правонарушение на территории охраняемых SANG объектов (военная база Форт-Занкудо, военный авианосец, остров Кайо-Перико) и прилегающей к ним местности; лица, совершившего правонарушение в отношении военнослужащего SANG или имущества SANG; военнослужащего SANG — по делам о воинских правонарушениях; лица, застигнутого при совершении правонарушения или непосредственно после его совершения либо находящегося в розыске, — при патрулировании в порядке статьи 7.1 закона «О Национальной Гвардии штата San-Andreas»; любого лица — в период чрезвычайного или военного положения, при проведении контртеррористической операции, а также при оказании содействия правоохранительным органам по их запросу;</w:t>
+        <w:t>а) военнослужащие SANG — в отношении лица, совершившего правонарушение на территории охраняемых SANG объектов (военная база Форт-Занкудо, военный авианосец, остров Кайо-Перико) и прилегающей к ним местности; лица, совершившего правонарушение в отношении военнослужащего SANG или имущества SANG; военнослужащего SANG — по делам о воинских правонарушениях; лица, застигнутого при совершении правонарушения или непосредственно после его совершения либо находящегося в розыске, — при патрулировании в соответствии с действующим законодательством штата San-Andreas; любого лица — в период чрезвычайного или военного положения, при проведении контртеррористической операции, а также при оказании содействия правоохранительным органам по их запросу;</w:t>
       </w:r>
     </w:p>
     <w:p>
@@ -7817,225 +7817,7 @@
           <w:i w:val="0"/>
           <w:u w:val="none"/>
         </w:rPr>
-        <w:t xml:space="preserve">а) военнослужащие SANG — в отношении лица, совершившего правонарушение на территории охраняемых SANG объектов (военная база Форт-Занкудо, военный авианосец, остров Кайо-Перико) и прилегающей к ним местности; лица, совершившего правонарушение в отношении военнослужащего SANG или имущества SANG; военнослужащего SANG — по делам о воинских правонарушениях; лица, застигнутого при совершении правонарушения или непосредственно после его совершения либо находящегося в розыске, — при патрулировании в порядке </w:t>
-      </w:r>
-      <w:r>
-        <w:rPr>
-          <w:b w:val="0"/>
-          <w:i w:val="0"/>
-          <w:color w:val="1F3A93"/>
-          <w:u w:val="single"/>
-        </w:rPr>
-        <w:t>статьи 7.1 закона «О Национальной Гвардии штата San-Andreas»</w:t>
-      </w:r>
-      <w:r>
-        <w:rPr>
-          <w:b w:val="0"/>
-          <w:i w:val="0"/>
-          <w:u w:val="none"/>
-        </w:rPr>
-        <w:t>; любого лица — в период чрезвычайного или военного положения, при проведении контртеррористической операции, а также при оказании содействия правоохранительным органам по их запросу;</w:t>
-      </w:r>
-    </w:p>
-    <w:p>
-      <w:pPr>
-        <w:spacing w:after="0" w:before="0"/>
-        <w:ind w:left="567"/>
-        <w:shd w:val="clear" w:color="auto" w:fill="F2F2F2"/>
-        <w:pBdr>
-          <w:left w:val="single" w:sz="18" w:space="4" w:color="7F7F7F"/>
-        </w:pBdr>
-      </w:pPr>
-      <w:r>
-        <w:rPr>
-          <w:b/>
-          <w:i/>
-          <w:color w:val="404040"/>
-          <w:sz w:val="20"/>
-          <w:u w:val="none"/>
-        </w:rPr>
-        <w:t>▸ Ссылка «статьи 7.1 закона «О Национальной Гвардии штата San-Andreas»» → ст. 7.1 — Закон «О Национальной Гвардии штата San-Andreas» (158.txt), новая статья, в редакции ACT. 003</w:t>
-      </w:r>
-      <w:r>
-        <w:rPr>
-          <w:b/>
-          <w:i/>
-          <w:color w:val="404040"/>
-          <w:sz w:val="20"/>
-          <w:u w:val="none"/>
-        </w:rPr>
-        <w:t>:</w:t>
-      </w:r>
-    </w:p>
-    <w:p>
-      <w:pPr>
-        <w:spacing w:after="0" w:before="0"/>
-        <w:ind w:left="567"/>
-        <w:shd w:val="clear" w:color="auto" w:fill="F2F2F2"/>
-        <w:pBdr>
-          <w:left w:val="single" w:sz="18" w:space="4" w:color="7F7F7F"/>
-        </w:pBdr>
-      </w:pPr>
-      <w:r>
-        <w:rPr>
-          <w:b w:val="0"/>
-          <w:i w:val="0"/>
-          <w:sz w:val="20"/>
-          <w:u w:val="none"/>
-        </w:rPr>
-        <w:t>Статья 7.1. Патрулирование</w:t>
-      </w:r>
-    </w:p>
-    <w:p>
-      <w:pPr>
-        <w:spacing w:after="0" w:before="0"/>
-        <w:ind w:left="567"/>
-        <w:shd w:val="clear" w:color="auto" w:fill="F2F2F2"/>
-        <w:pBdr>
-          <w:left w:val="single" w:sz="18" w:space="4" w:color="7F7F7F"/>
-        </w:pBdr>
-      </w:pPr>
-      <w:r>
-        <w:rPr>
-          <w:b w:val="0"/>
-          <w:i w:val="0"/>
-          <w:sz w:val="20"/>
-          <w:u w:val="none"/>
-        </w:rPr>
-        <w:t>ч. 1 Войска SANG осуществляют патрулирование на всей территории штата San-Andreas (включая территорию округа Блэйн, округа Лос-Сантос, города Лос-Сантос и острова Кайо-Перико) со следующими оговорками:</w:t>
-      </w:r>
-    </w:p>
-    <w:p>
-      <w:pPr>
-        <w:spacing w:after="0" w:before="0"/>
-        <w:ind w:left="567"/>
-        <w:shd w:val="clear" w:color="auto" w:fill="F2F2F2"/>
-        <w:pBdr>
-          <w:left w:val="single" w:sz="18" w:space="4" w:color="7F7F7F"/>
-        </w:pBdr>
-      </w:pPr>
-      <w:r>
-        <w:rPr>
-          <w:b w:val="0"/>
-          <w:i w:val="0"/>
-          <w:sz w:val="20"/>
-          <w:u w:val="none"/>
-        </w:rPr>
-        <w:t>а) патрулирование территории охраняемых SANG объектов и прилегающей местности в радиусе 2 км осуществляется в порядке части 1 статьи 7 настоящего Закона;</w:t>
-      </w:r>
-    </w:p>
-    <w:p>
-      <w:pPr>
-        <w:spacing w:after="0" w:before="0"/>
-        <w:ind w:left="567"/>
-        <w:shd w:val="clear" w:color="auto" w:fill="F2F2F2"/>
-        <w:pBdr>
-          <w:left w:val="single" w:sz="18" w:space="4" w:color="7F7F7F"/>
-        </w:pBdr>
-      </w:pPr>
-      <w:r>
-        <w:rPr>
-          <w:b w:val="0"/>
-          <w:i w:val="0"/>
-          <w:sz w:val="20"/>
-          <w:u w:val="none"/>
-        </w:rPr>
-        <w:t>б) патрулирование на территории округа Блэйн и округа Лос-Сантос за пределами города Лос-Сантос осуществляется патрулями SANG самостоятельно;</w:t>
-      </w:r>
-    </w:p>
-    <w:p>
-      <w:pPr>
-        <w:spacing w:after="0" w:before="0"/>
-        <w:ind w:left="567"/>
-        <w:shd w:val="clear" w:color="auto" w:fill="F2F2F2"/>
-        <w:pBdr>
-          <w:left w:val="single" w:sz="18" w:space="4" w:color="7F7F7F"/>
-        </w:pBdr>
-      </w:pPr>
-      <w:r>
-        <w:rPr>
-          <w:b w:val="0"/>
-          <w:i w:val="0"/>
-          <w:sz w:val="20"/>
-          <w:u w:val="none"/>
-        </w:rPr>
-        <w:t>в) при осуществлении патрулирования на территории города Лос-Сантос военнослужащие SANG заблаговременно уведомляют LSPD и FIB посредством волны департамента (рации департамента), либо осуществляют совместное патрулирование с сотрудниками LSPD или FIB, либо действуют в период действия чрезвычайного или военного положения или проведения контртеррористической операции.</w:t>
-      </w:r>
-    </w:p>
-    <w:p>
-      <w:pPr>
-        <w:spacing w:after="0" w:before="0"/>
-        <w:ind w:left="567"/>
-        <w:shd w:val="clear" w:color="auto" w:fill="F2F2F2"/>
-        <w:pBdr>
-          <w:left w:val="single" w:sz="18" w:space="4" w:color="7F7F7F"/>
-        </w:pBdr>
-      </w:pPr>
-      <w:r>
-        <w:rPr>
-          <w:b w:val="0"/>
-          <w:i w:val="0"/>
-          <w:sz w:val="20"/>
-          <w:u w:val="none"/>
-        </w:rPr>
-        <w:t>ч. 2 Патруль состоит не менее чем из двух военнослужащих. В составе патруля обязательно находится военнослужащий подразделения Military Police (MP) либо военнослужащий, имеющий звание не ниже шестого порядкового ранга согласно штатной структуре (уставу) SANG. Патрулирование в составе, не отвечающем требованиям настоящей части, не допускается; задержание, произведённое таким патрулём, признаётся незаконным.</w:t>
-      </w:r>
-    </w:p>
-    <w:p>
-      <w:pPr>
-        <w:spacing w:after="0" w:before="0"/>
-        <w:ind w:left="567"/>
-        <w:shd w:val="clear" w:color="auto" w:fill="F2F2F2"/>
-        <w:pBdr>
-          <w:left w:val="single" w:sz="18" w:space="4" w:color="7F7F7F"/>
-        </w:pBdr>
-      </w:pPr>
-      <w:r>
-        <w:rPr>
-          <w:b w:val="0"/>
-          <w:i w:val="0"/>
-          <w:sz w:val="20"/>
-          <w:u w:val="none"/>
-        </w:rPr>
-        <w:t>ч. 3 При патрулировании военнослужащие SANG вправе: требовать от граждан соблюдения общественного порядка и прекращения правонарушений; пресекать преступления и правонарушения; проверять документы, удостоверяющие личность, у лиц, в отношении которых имеются основания полагать, что они совершили правонарушение или находятся в розыске; охранять место происшествия до прибытия сотрудников правоохранительных органов; производить задержание лиц, совершивших правонарушение, с проведением первичного (личного) обыска без права изъятия оружия и предметов и незамедлительной доставкой и передачей задержанного в порядке статьи 17.3 Процессуального кодекса штата San-Andreas; оказывать содействие правоохранительным органам.</w:t>
-      </w:r>
-    </w:p>
-    <w:p>
-      <w:pPr>
-        <w:spacing w:after="0" w:before="0"/>
-        <w:ind w:left="567"/>
-        <w:shd w:val="clear" w:color="auto" w:fill="F2F2F2"/>
-        <w:pBdr>
-          <w:left w:val="single" w:sz="18" w:space="4" w:color="7F7F7F"/>
-        </w:pBdr>
-      </w:pPr>
-      <w:r>
-        <w:rPr>
-          <w:b w:val="0"/>
-          <w:i w:val="0"/>
-          <w:sz w:val="20"/>
-          <w:u w:val="none"/>
-        </w:rPr>
-        <w:t>ч. 4 Патруль SANG не назначает меры наказания, не составляет протоколы об административных правонарушениях, не проводит процессуальные действия, отнесённые к исключительной компетенции правоохранительных органов, и не производит изъятие оружия и запрещённых предметов. Выявленные административные правонарушения фиксируются и передаются в LSPD или LSCSD по территориальности.</w:t>
-      </w:r>
-    </w:p>
-    <w:p>
-      <w:pPr>
-        <w:spacing w:after="0" w:before="0"/>
-        <w:ind w:left="567"/>
-        <w:shd w:val="clear" w:color="auto" w:fill="F2F2F2"/>
-        <w:pBdr>
-          <w:left w:val="single" w:sz="18" w:space="4" w:color="7F7F7F"/>
-        </w:pBdr>
-      </w:pPr>
-      <w:r>
-        <w:rPr>
-          <w:b w:val="0"/>
-          <w:i w:val="0"/>
-          <w:sz w:val="20"/>
-          <w:u w:val="none"/>
-        </w:rPr>
-        <w:t>ч. 5 Военнослужащие патруля обязаны находиться в форменной одежде SANG, иметь при себе служебное удостоверение (нашивку), использовать служебный транспорт и вести видеофиксацию в порядке части 5 статьи 10 настоящего Закона.</w:t>
+        <w:t>а) военнослужащие SANG — в отношении лица, совершившего правонарушение на территории охраняемых SANG объектов (военная база Форт-Занкудо, военный авианосец, остров Кайо-Перико) и прилегающей к ним местности; лица, совершившего правонарушение в отношении военнослужащего SANG или имущества SANG; военнослужащего SANG — по делам о воинских правонарушениях; лица, застигнутого при совершении правонарушения или непосредственно после его совершения либо находящегося в розыске, — при патрулировании в соответствии с действующим законодательством штата San-Andreas; любого лица — в период чрезвычайного или военного положения, при проведении контртеррористической операции, а также при оказании содействия правоохранительным органам по их запросу;</w:t>
       </w:r>
     </w:p>
     <w:p>

</xml_diff>